<commit_message>
Add result figures generated from genuine training logs and evaluation output
5 figures, all built from real data (no mockups):
- Fig 1: per-model classification metric bar chart (runs/eval_report_*.json)
- Fig 2: train/val loss and accuracy curves over 6 epochs (training_log_v2.txt)
- Fig 3: hybrid model confusion matrix, with a data-verified observation
  that errors concentrate on the bkl/mel/nv boundary (8/23 bkl->nv,
  10/17 mel->nv), not spread uniformly
- Fig 4: qualitative Grad-CAM++ / Attention Rollout / ground-truth-mask
  comparison on a real, correctly-classified test image (via
  scripts/make_xai_figure.py running actual inference on the saved
  checkpoint)
- Fig 5: ablation bar charts (architecture, preprocessing)

Inserted into both docs/paper.docx (via scripts/build_docx.js) and
docs/paper.tex, with captions and discussion text tied to the exact
numbers shown.

Co-Authored-By: Claude Sonnet 5 <noreply@anthropic.com>
</commit_message>
<xml_diff>
--- a/docs/paper.docx
+++ b/docs/paper.docx
@@ -1299,6 +1299,207 @@
     </w:p>
     <w:p>
       <w:pPr>
+        <w:spacing w:after="80" w:before="200"/>
+        <w:jc w:val="center"/>
+      </w:pPr>
+      <w:r>
+        <w:drawing>
+          <wp:inline distT="0" distB="0" distL="0" distR="0">
+            <wp:extent cx="4762500" cy="2676525"/>
+            <wp:effectExtent t="0" r="0" b="0" l="0"/>
+            <wp:docPr id="1" name="" descr="" title=""/>
+            <wp:cNvGraphicFramePr>
+              <a:graphicFrameLocks xmlns:a="http://schemas.openxmlformats.org/drawingml/2006/main" noChangeAspect="1"/>
+            </wp:cNvGraphicFramePr>
+            <a:graphic xmlns:a="http://schemas.openxmlformats.org/drawingml/2006/main">
+              <a:graphicData uri="http://schemas.openxmlformats.org/drawingml/2006/picture">
+                <pic:pic xmlns:pic="http://schemas.openxmlformats.org/drawingml/2006/picture">
+                  <pic:nvPicPr>
+                    <pic:cNvPr id="0" name="" descr=""/>
+                    <pic:cNvPicPr>
+                      <a:picLocks noChangeAspect="1" noChangeArrowheads="1"/>
+                    </pic:cNvPicPr>
+                  </pic:nvPicPr>
+                  <pic:blipFill>
+                    <a:blip r:embed="rId9" cstate="none"/>
+                    <a:srcRect/>
+                    <a:stretch>
+                      <a:fillRect/>
+                    </a:stretch>
+                  </pic:blipFill>
+                  <pic:spPr bwMode="auto">
+                    <a:xfrm>
+                      <a:off x="0" y="0"/>
+                      <a:ext cx="4762500" cy="2676525"/>
+                    </a:xfrm>
+                    <a:prstGeom prst="rect">
+                      <a:avLst/>
+                    </a:prstGeom>
+                  </pic:spPr>
+                </pic:pic>
+              </a:graphicData>
+            </a:graphic>
+          </wp:inline>
+        </w:drawing>
+      </w:r>
+    </w:p>
+    <w:p>
+      <w:pPr>
+        <w:spacing w:after="200"/>
+        <w:jc w:val="center"/>
+      </w:pPr>
+      <w:r>
+        <w:rPr>
+          <w:i/>
+          <w:iCs/>
+          <w:sz w:val="18"/>
+          <w:szCs w:val="18"/>
+        </w:rPr>
+        <w:t xml:space="preserve">Fig. 1. Classification performance by model (test set, n=201).</w:t>
+      </w:r>
+    </w:p>
+    <w:p>
+      <w:pPr>
+        <w:spacing w:after="80" w:before="200"/>
+        <w:jc w:val="center"/>
+      </w:pPr>
+      <w:r>
+        <w:drawing>
+          <wp:inline distT="0" distB="0" distL="0" distR="0">
+            <wp:extent cx="4953000" cy="2590800"/>
+            <wp:effectExtent t="0" r="0" b="0" l="0"/>
+            <wp:docPr id="1" name="" descr="" title=""/>
+            <wp:cNvGraphicFramePr>
+              <a:graphicFrameLocks xmlns:a="http://schemas.openxmlformats.org/drawingml/2006/main" noChangeAspect="1"/>
+            </wp:cNvGraphicFramePr>
+            <a:graphic xmlns:a="http://schemas.openxmlformats.org/drawingml/2006/main">
+              <a:graphicData uri="http://schemas.openxmlformats.org/drawingml/2006/picture">
+                <pic:pic xmlns:pic="http://schemas.openxmlformats.org/drawingml/2006/picture">
+                  <pic:nvPicPr>
+                    <pic:cNvPr id="0" name="" descr=""/>
+                    <pic:cNvPicPr>
+                      <a:picLocks noChangeAspect="1" noChangeArrowheads="1"/>
+                    </pic:cNvPicPr>
+                  </pic:nvPicPr>
+                  <pic:blipFill>
+                    <a:blip r:embed="rId10" cstate="none"/>
+                    <a:srcRect/>
+                    <a:stretch>
+                      <a:fillRect/>
+                    </a:stretch>
+                  </pic:blipFill>
+                  <pic:spPr bwMode="auto">
+                    <a:xfrm>
+                      <a:off x="0" y="0"/>
+                      <a:ext cx="4953000" cy="2590800"/>
+                    </a:xfrm>
+                    <a:prstGeom prst="rect">
+                      <a:avLst/>
+                    </a:prstGeom>
+                  </pic:spPr>
+                </pic:pic>
+              </a:graphicData>
+            </a:graphic>
+          </wp:inline>
+        </w:drawing>
+      </w:r>
+    </w:p>
+    <w:p>
+      <w:pPr>
+        <w:spacing w:after="200"/>
+        <w:jc w:val="center"/>
+      </w:pPr>
+      <w:r>
+        <w:rPr>
+          <w:i/>
+          <w:iCs/>
+          <w:sz w:val="18"/>
+          <w:szCs w:val="18"/>
+        </w:rPr>
+        <w:t xml:space="preserve">Fig. 2. Training/validation loss and accuracy over 6 epochs for all four models.</w:t>
+      </w:r>
+    </w:p>
+    <w:p>
+      <w:pPr>
+        <w:spacing w:after="160"/>
+        <w:jc w:val="both"/>
+      </w:pPr>
+      <w:r>
+        <w:t xml:space="preserve">Figure 2 shows all four models still improving at epoch 6 without clear overfitting (validation loss tracking or below training loss throughout), suggesting that — consistent with the compute-driven limitation disclosed in Section V — additional epochs would likely improve results further rather than the models having converged.</w:t>
+      </w:r>
+    </w:p>
+    <w:p>
+      <w:pPr>
+        <w:spacing w:after="80" w:before="200"/>
+        <w:jc w:val="center"/>
+      </w:pPr>
+      <w:r>
+        <w:drawing>
+          <wp:inline distT="0" distB="0" distL="0" distR="0">
+            <wp:extent cx="3619500" cy="3286125"/>
+            <wp:effectExtent t="0" r="0" b="0" l="0"/>
+            <wp:docPr id="1" name="" descr="" title=""/>
+            <wp:cNvGraphicFramePr>
+              <a:graphicFrameLocks xmlns:a="http://schemas.openxmlformats.org/drawingml/2006/main" noChangeAspect="1"/>
+            </wp:cNvGraphicFramePr>
+            <a:graphic xmlns:a="http://schemas.openxmlformats.org/drawingml/2006/main">
+              <a:graphicData uri="http://schemas.openxmlformats.org/drawingml/2006/picture">
+                <pic:pic xmlns:pic="http://schemas.openxmlformats.org/drawingml/2006/picture">
+                  <pic:nvPicPr>
+                    <pic:cNvPr id="0" name="" descr=""/>
+                    <pic:cNvPicPr>
+                      <a:picLocks noChangeAspect="1" noChangeArrowheads="1"/>
+                    </pic:cNvPicPr>
+                  </pic:nvPicPr>
+                  <pic:blipFill>
+                    <a:blip r:embed="rId11" cstate="none"/>
+                    <a:srcRect/>
+                    <a:stretch>
+                      <a:fillRect/>
+                    </a:stretch>
+                  </pic:blipFill>
+                  <pic:spPr bwMode="auto">
+                    <a:xfrm>
+                      <a:off x="0" y="0"/>
+                      <a:ext cx="3619500" cy="3286125"/>
+                    </a:xfrm>
+                    <a:prstGeom prst="rect">
+                      <a:avLst/>
+                    </a:prstGeom>
+                  </pic:spPr>
+                </pic:pic>
+              </a:graphicData>
+            </a:graphic>
+          </wp:inline>
+        </w:drawing>
+      </w:r>
+    </w:p>
+    <w:p>
+      <w:pPr>
+        <w:spacing w:after="200"/>
+        <w:jc w:val="center"/>
+      </w:pPr>
+      <w:r>
+        <w:rPr>
+          <w:i/>
+          <w:iCs/>
+          <w:sz w:val="18"/>
+          <w:szCs w:val="18"/>
+        </w:rPr>
+        <w:t xml:space="preserve">Fig. 3. Confusion matrix for the proposed hybrid model (test set, n=201).</w:t>
+      </w:r>
+    </w:p>
+    <w:p>
+      <w:pPr>
+        <w:spacing w:after="160"/>
+        <w:jc w:val="both"/>
+      </w:pPr>
+      <w:r>
+        <w:t xml:space="preserve">Figure 3 shows the hybrid model's errors concentrate along the bkl/mel/nv boundary (e.g., 8 of 23 true bkl images predicted as nv, 10 of 17 true mel images predicted as nv) rather than being spread uniformly across classes — consistent with the well-documented clinical difficulty of visually distinguishing benign keratoses, melanoma, and melanocytic nevi in dermoscopic images, rather than an idiosyncratic model failure mode.</w:t>
+      </w:r>
+    </w:p>
+    <w:p>
+      <w:pPr>
         <w:pStyle w:val="Heading2"/>
         <w:spacing w:after="120" w:before="240"/>
       </w:pPr>
@@ -1313,6 +1514,76 @@
       </w:pPr>
       <w:r>
         <w:t xml:space="preserve">For the proposed hybrid model, mean faithfulness IoU (Grad-CAM++ vs. ground-truth lesion mask) was 0.163, and Pointing Game accuracy was 42.8% — i.e., the single most-activated pixel of the Grad-CAM++ map fell inside the true lesion region in 42.8% of test images. These values are modest in absolute terms, consistent with a model fine-tuned for only 6 epochs on 800 images; they are reported without adjustment, as an honest baseline for future full-scale comparison, rather than presented as a mature clinical-grade result.</w:t>
+      </w:r>
+    </w:p>
+    <w:p>
+      <w:pPr>
+        <w:spacing w:after="80" w:before="200"/>
+        <w:jc w:val="center"/>
+      </w:pPr>
+      <w:r>
+        <w:drawing>
+          <wp:inline distT="0" distB="0" distL="0" distR="0">
+            <wp:extent cx="5334000" cy="1352550"/>
+            <wp:effectExtent t="0" r="0" b="0" l="0"/>
+            <wp:docPr id="1" name="" descr="" title=""/>
+            <wp:cNvGraphicFramePr>
+              <a:graphicFrameLocks xmlns:a="http://schemas.openxmlformats.org/drawingml/2006/main" noChangeAspect="1"/>
+            </wp:cNvGraphicFramePr>
+            <a:graphic xmlns:a="http://schemas.openxmlformats.org/drawingml/2006/main">
+              <a:graphicData uri="http://schemas.openxmlformats.org/drawingml/2006/picture">
+                <pic:pic xmlns:pic="http://schemas.openxmlformats.org/drawingml/2006/picture">
+                  <pic:nvPicPr>
+                    <pic:cNvPr id="0" name="" descr=""/>
+                    <pic:cNvPicPr>
+                      <a:picLocks noChangeAspect="1" noChangeArrowheads="1"/>
+                    </pic:cNvPicPr>
+                  </pic:nvPicPr>
+                  <pic:blipFill>
+                    <a:blip r:embed="rId12" cstate="none"/>
+                    <a:srcRect/>
+                    <a:stretch>
+                      <a:fillRect/>
+                    </a:stretch>
+                  </pic:blipFill>
+                  <pic:spPr bwMode="auto">
+                    <a:xfrm>
+                      <a:off x="0" y="0"/>
+                      <a:ext cx="5334000" cy="1352550"/>
+                    </a:xfrm>
+                    <a:prstGeom prst="rect">
+                      <a:avLst/>
+                    </a:prstGeom>
+                  </pic:spPr>
+                </pic:pic>
+              </a:graphicData>
+            </a:graphic>
+          </wp:inline>
+        </w:drawing>
+      </w:r>
+    </w:p>
+    <w:p>
+      <w:pPr>
+        <w:spacing w:after="200"/>
+        <w:jc w:val="center"/>
+      </w:pPr>
+      <w:r>
+        <w:rPr>
+          <w:i/>
+          <w:iCs/>
+          <w:sz w:val="18"/>
+          <w:szCs w:val="18"/>
+        </w:rPr>
+        <w:t xml:space="preserve">Fig. 4. Qualitative example (a correctly-classified test image) comparing Grad-CAM++ and Attention Rollout saliency against the ground-truth lesion mask.</w:t>
+      </w:r>
+    </w:p>
+    <w:p>
+      <w:pPr>
+        <w:spacing w:after="160"/>
+        <w:jc w:val="both"/>
+      </w:pPr>
+      <w:r>
+        <w:t xml:space="preserve">Figure 4 illustrates a representative case: both Grad-CAM++ and Attention Rollout concentrate activation within the true lesion boundary, though on different sub-regions of it — the specific behavior the cross-method agreement score and mask-anchored IoU in Sections III-D-E are designed to quantify rather than leave to visual impression.</w:t>
       </w:r>
     </w:p>
     <w:p>
@@ -1891,6 +2162,67 @@
       </w:pPr>
       <w:r>
         <w:t xml:space="preserve"> </w:t>
+      </w:r>
+    </w:p>
+    <w:p>
+      <w:pPr>
+        <w:spacing w:after="80" w:before="200"/>
+        <w:jc w:val="center"/>
+      </w:pPr>
+      <w:r>
+        <w:drawing>
+          <wp:inline distT="0" distB="0" distL="0" distR="0">
+            <wp:extent cx="5334000" cy="2133600"/>
+            <wp:effectExtent t="0" r="0" b="0" l="0"/>
+            <wp:docPr id="1" name="" descr="" title=""/>
+            <wp:cNvGraphicFramePr>
+              <a:graphicFrameLocks xmlns:a="http://schemas.openxmlformats.org/drawingml/2006/main" noChangeAspect="1"/>
+            </wp:cNvGraphicFramePr>
+            <a:graphic xmlns:a="http://schemas.openxmlformats.org/drawingml/2006/main">
+              <a:graphicData uri="http://schemas.openxmlformats.org/drawingml/2006/picture">
+                <pic:pic xmlns:pic="http://schemas.openxmlformats.org/drawingml/2006/picture">
+                  <pic:nvPicPr>
+                    <pic:cNvPr id="0" name="" descr=""/>
+                    <pic:cNvPicPr>
+                      <a:picLocks noChangeAspect="1" noChangeArrowheads="1"/>
+                    </pic:cNvPicPr>
+                  </pic:nvPicPr>
+                  <pic:blipFill>
+                    <a:blip r:embed="rId13" cstate="none"/>
+                    <a:srcRect/>
+                    <a:stretch>
+                      <a:fillRect/>
+                    </a:stretch>
+                  </pic:blipFill>
+                  <pic:spPr bwMode="auto">
+                    <a:xfrm>
+                      <a:off x="0" y="0"/>
+                      <a:ext cx="5334000" cy="2133600"/>
+                    </a:xfrm>
+                    <a:prstGeom prst="rect">
+                      <a:avLst/>
+                    </a:prstGeom>
+                  </pic:spPr>
+                </pic:pic>
+              </a:graphicData>
+            </a:graphic>
+          </wp:inline>
+        </w:drawing>
+      </w:r>
+    </w:p>
+    <w:p>
+      <w:pPr>
+        <w:spacing w:after="200"/>
+        <w:jc w:val="center"/>
+      </w:pPr>
+      <w:r>
+        <w:rPr>
+          <w:i/>
+          <w:iCs/>
+          <w:sz w:val="18"/>
+          <w:szCs w:val="18"/>
+        </w:rPr>
+        <w:t xml:space="preserve">Fig. 5. Ablation results: architecture (left) and preprocessing (right).</w:t>
       </w:r>
     </w:p>
     <w:p>

</xml_diff>